<commit_message>
cập nhật mẫu mới
</commit_message>
<xml_diff>
--- a/static/media/1.qd_ktra_HT.docx
+++ b/static/media/1.qd_ktra_HT.docx
@@ -376,19 +376,16 @@
           <w:color w:val="000000" w:themeColor="text1"/>
           <w:szCs w:val="28"/>
         </w:rPr>
-        <w:t>Về việc kiểm tra chấp hành pháp luật thuế tại</w:t>
-      </w:r>
-    </w:p>
-    <w:p>
-      <w:pPr>
-        <w:spacing w:after="0" w:line="240" w:lineRule="auto"/>
-        <w:jc w:val="center"/>
+        <w:t>Về việc kiểm tra thuế tại</w:t>
+      </w:r>
+      <w:r>
         <w:rPr>
           <w:b/>
           <w:color w:val="000000" w:themeColor="text1"/>
           <w:szCs w:val="28"/>
         </w:rPr>
-      </w:pPr>
+        <w:t xml:space="preserve"> </w:t>
+      </w:r>
       <w:r>
         <w:rPr>
           <w:b/>
@@ -949,7 +946,7 @@
         <w:t xml:space="preserve"> </w:t>
       </w:r>
       <w:r>
-        <w:t>Kiểm tra chấp hành pháp luật thuế tại</w:t>
+        <w:t>Kiểm tra thuế tại</w:t>
       </w:r>
       <w:r>
         <w:rPr>
@@ -1126,7 +1123,7 @@
           <w:color w:val="000000" w:themeColor="text1"/>
           <w:szCs w:val="28"/>
         </w:rPr>
-        <w:t xml:space="preserve"> năm: năm &lt;nam_ktra&gt;</w:t>
+        <w:t xml:space="preserve"> năm: &lt;nam_ktra&gt;</w:t>
       </w:r>
       <w:r>
         <w:rPr>
@@ -1512,7 +1509,6 @@
           <w:color w:val="000000" w:themeColor="text1"/>
           <w:sz w:val="22"/>
         </w:rPr>
-        <w:lastRenderedPageBreak/>
         <w:t xml:space="preserve">- </w:t>
       </w:r>
       <w:r>
@@ -1543,6 +1539,7 @@
           <w:color w:val="000000" w:themeColor="text1"/>
           <w:sz w:val="22"/>
         </w:rPr>
+        <w:lastRenderedPageBreak/>
         <w:t>- Lưu: VT, TTKT</w:t>
       </w:r>
       <w:r>

</xml_diff>